<commit_message>
Guide: costs after switching to Claude Haiku 5.5
Co-Authored-By: Claude Opus 5.5 <noreply@anthropic.com>
</commit_message>
<xml_diff>
--- a/static/reports/build-your-own-app-guide.docx
+++ b/static/reports/build-your-own-app-guide.docx
@@ -1176,16 +1176,48 @@
         <w:t>AI in the app:</w:t>
       </w:r>
       <w:r>
-        <w:t xml:space="preserve"> with Claude Haiku, the cheapest model, about </w:t>
+        <w:t xml:space="preserve"> I started on Claude Haiku 4.5 at about 5 to 10 cents per full 20-turn adventure. When </w:t>
       </w:r>
       <w:r>
         <w:rPr>
           <w:b/>
         </w:rPr>
-        <w:t>5 to 10 cents per full 20-turn adventure</w:t>
-      </w:r>
-      <w:r>
-        <w:t>. With a daily cap, the worst case is a few dollars a day, and real use is pennies.</w:t>
+        <w:t>Claude Haiku 5.5</w:t>
+      </w:r>
+      <w:r>
+        <w:t xml:space="preserve"> came out, ten times cheaper per token, I switched by changing one line on my server. Now a full adventure costs </w:t>
+      </w:r>
+      <w:r>
+        <w:rPr>
+          <w:b/>
+        </w:rPr>
+        <w:t>roughly a cent</w:t>
+      </w:r>
+      <w:r>
+        <w:t>. With my daily cap, the worst case is well under a dollar a day.</w:t>
+      </w:r>
+    </w:p>
+    <w:p>
+      <w:pPr>
+        <w:pStyle w:val="ListBullet"/>
+      </w:pPr>
+      <w:r>
+        <w:rPr>
+          <w:b/>
+        </w:rPr>
+        <w:t>Tip:</w:t>
+      </w:r>
+      <w:r>
+        <w:t xml:space="preserve"> new, cheaper models come out often. Because the AI lives on your server, not in the app, switching takes minutes and your users don't need an update. With Haiku 5.5, ask for </w:t>
+      </w:r>
+      <w:r>
+        <w:rPr>
+          <w:b/>
+        </w:rPr>
+        <w:t>low effort</w:t>
+      </w:r>
+      <w:r>
+        <w:t>, so it thinks briefly and stays fast.</w:t>
       </w:r>
     </w:p>
     <w:p>

</xml_diff>